<commit_message>
Use of Artificial Intelligence Form
</commit_message>
<xml_diff>
--- a/src/appendix/formulariouso-iaptengversao-dissertacaotesefinal.docx
+++ b/src/appendix/formulariouso-iaptengversao-dissertacaotesefinal.docx
@@ -1,18 +1,10 @@
 
 <file path=word/document.xml><?xml version="1.0" encoding="utf-8"?>
-<w:document xmlns:wpc="http://schemas.microsoft.com/office/word/2010/wordprocessingCanvas" xmlns:cx="http://schemas.microsoft.com/office/drawing/2014/chartex" xmlns:cx1="http://schemas.microsoft.com/office/drawing/2015/9/8/chartex" xmlns:cx2="http://schemas.microsoft.com/office/drawing/2015/10/21/chartex" xmlns:cx3="http://schemas.microsoft.com/office/drawing/2016/5/9/chartex" xmlns:cx4="http://schemas.microsoft.com/office/drawing/2016/5/10/chartex" xmlns:cx5="http://schemas.microsoft.com/office/drawing/2016/5/11/chartex" xmlns:cx6="http://schemas.microsoft.com/office/drawing/2016/5/12/chartex" xmlns:cx7="http://schemas.microsoft.com/office/drawing/2016/5/13/chartex" xmlns:cx8="http://schemas.microsoft.com/office/drawing/2016/5/14/chartex" xmlns:mc="http://schemas.openxmlformats.org/markup-compatibility/2006" xmlns:aink="http://schemas.microsoft.com/office/drawing/2016/ink" xmlns:am3d="http://schemas.microsoft.com/office/drawing/2017/model3d" xmlns:o="urn:schemas-microsoft-com:office:office" xmlns:oel="http://schemas.microsoft.com/office/2019/extlst" xmlns:r="http://schemas.openxmlformats.org/officeDocument/2006/relationships" xmlns:m="http://schemas.openxmlformats.org/officeDocument/2006/math" xmlns:v="urn:schemas-microsoft-com:vml" xmlns:wp14="http://schemas.microsoft.com/office/word/2010/wordprocessingDrawing" xmlns:wp="http://schemas.openxmlformats.org/drawingml/2006/wordprocessingDrawing" xmlns:w10="urn:schemas-microsoft-com:office:word" xmlns:w="http://schemas.openxmlformats.org/wordprocessingml/2006/main" xmlns:w14="http://schemas.microsoft.com/office/word/2010/wordml" xmlns:w15="http://schemas.microsoft.com/office/word/2012/wordml" xmlns:w16cei="http://schemas.microsoft.com/office/word/2026/wordml/cei" xmlns:w16cex="http://schemas.microsoft.com/office/word/2018/wordml/cex" xmlns:w16cid="http://schemas.microsoft.com/office/word/2016/wordml/cid" xmlns:w16="http://schemas.microsoft.com/office/word/2018/wordml" xmlns:w16du="http://schemas.microsoft.com/office/word/2023/wordml/word16du" xmlns:w16sdtdh="http://schemas.microsoft.com/office/word/2020/wordml/sdtdatahash" xmlns:w16sdtfl="http://schemas.microsoft.com/office/word/2024/wordml/sdtformatlock" xmlns:w16se="http://schemas.microsoft.com/office/word/2015/wordml/symex" xmlns:wpg="http://schemas.microsoft.com/office/word/2010/wordprocessingGroup" xmlns:wpi="http://schemas.microsoft.com/office/word/2010/wordprocessingInk" xmlns:wne="http://schemas.microsoft.com/office/word/2006/wordml" xmlns:wps="http://schemas.microsoft.com/office/word/2010/wordprocessingShape" mc:Ignorable="w14 w15 w16se w16cid w16 w16cex w16sdtdh w16sdtfl w16du wp14">
+<w:document xmlns:wpc="http://schemas.microsoft.com/office/word/2010/wordprocessingCanvas" xmlns:cx="http://schemas.microsoft.com/office/drawing/2014/chartex" xmlns:cx1="http://schemas.microsoft.com/office/drawing/2015/9/8/chartex" xmlns:cx2="http://schemas.microsoft.com/office/drawing/2015/10/21/chartex" xmlns:cx3="http://schemas.microsoft.com/office/drawing/2016/5/9/chartex" xmlns:cx4="http://schemas.microsoft.com/office/drawing/2016/5/10/chartex" xmlns:cx5="http://schemas.microsoft.com/office/drawing/2016/5/11/chartex" xmlns:cx6="http://schemas.microsoft.com/office/drawing/2016/5/12/chartex" xmlns:cx7="http://schemas.microsoft.com/office/drawing/2016/5/13/chartex" xmlns:cx8="http://schemas.microsoft.com/office/drawing/2016/5/14/chartex" xmlns:mc="http://schemas.openxmlformats.org/markup-compatibility/2006" xmlns:aink="http://schemas.microsoft.com/office/drawing/2016/ink" xmlns:am3d="http://schemas.microsoft.com/office/drawing/2017/model3d" xmlns:o="urn:schemas-microsoft-com:office:office" xmlns:oel="http://schemas.microsoft.com/office/2019/extlst" xmlns:r="http://schemas.openxmlformats.org/officeDocument/2006/relationships" xmlns:m="http://schemas.openxmlformats.org/officeDocument/2006/math" xmlns:v="urn:schemas-microsoft-com:vml" xmlns:wp14="http://schemas.microsoft.com/office/word/2010/wordprocessingDrawing" xmlns:wp="http://schemas.openxmlformats.org/drawingml/2006/wordprocessingDrawing" xmlns:w10="urn:schemas-microsoft-com:office:word" xmlns:w="http://schemas.openxmlformats.org/wordprocessingml/2006/main" xmlns:w14="http://schemas.microsoft.com/office/word/2010/wordml" xmlns:w15="http://schemas.microsoft.com/office/word/2012/wordml" xmlns:w16cex="http://schemas.microsoft.com/office/word/2018/wordml/cex" xmlns:w16cid="http://schemas.microsoft.com/office/word/2016/wordml/cid" xmlns:w16="http://schemas.microsoft.com/office/word/2018/wordml" xmlns:w16du="http://schemas.microsoft.com/office/word/2023/wordml/word16du" xmlns:w16sdtdh="http://schemas.microsoft.com/office/word/2020/wordml/sdtdatahash" xmlns:w16sdtfl="http://schemas.microsoft.com/office/word/2024/wordml/sdtformatlock" xmlns:w16se="http://schemas.microsoft.com/office/word/2015/wordml/symex" xmlns:wpg="http://schemas.microsoft.com/office/word/2010/wordprocessingGroup" xmlns:wpi="http://schemas.microsoft.com/office/word/2010/wordprocessingInk" xmlns:wne="http://schemas.microsoft.com/office/word/2006/wordml" xmlns:wps="http://schemas.microsoft.com/office/word/2010/wordprocessingShape" mc:Ignorable="w14 w15 w16se w16cid w16 w16cex w16sdtdh w16sdtfl w16du wp14">
   <w:body>
     <w:p>
       <w:pPr>
-        <w:spacing w:after="0" w:line="240" w:lineRule="auto"/>
-        <w:jc w:val="center"/>
-        <w:rPr>
-          <w:rFonts w:cs="Calibri"/>
-          <w:b/>
-          <w:bCs/>
-          <w:sz w:val="24"/>
-          <w:szCs w:val="24"/>
-        </w:rPr>
+        <w:pStyle w:val="NoSpacing"/>
       </w:pPr>
     </w:p>
     <w:p>
@@ -79,7 +71,6 @@
           <w:lang w:val="en-US"/>
         </w:rPr>
       </w:pPr>
-      <w:proofErr w:type="gramStart"/>
       <w:r>
         <w:rPr>
           <w:b/>
@@ -88,18 +79,7 @@
           <w:iCs/>
           <w:lang w:val="en-US"/>
         </w:rPr>
-        <w:t>Form</w:t>
-      </w:r>
-      <w:proofErr w:type="gramEnd"/>
-      <w:r>
-        <w:rPr>
-          <w:b/>
-          <w:bCs/>
-          <w:i/>
-          <w:iCs/>
-          <w:lang w:val="en-US"/>
-        </w:rPr>
-        <w:t>: Use of Artificial Intelligence (AI) Tools in Academic Work</w:t>
+        <w:t>Form: Use of Artificial Intelligence (AI) Tools in Academic Work</w:t>
       </w:r>
     </w:p>
     <w:p>
@@ -178,7 +158,6 @@
         </w:rPr>
         <w:t xml:space="preserve"> final </w:t>
       </w:r>
-      <w:proofErr w:type="gramStart"/>
       <w:r>
         <w:rPr>
           <w:rFonts w:cs="Calibri"/>
@@ -190,7 +169,6 @@
         </w:rPr>
         <w:t>Master’s</w:t>
       </w:r>
-      <w:proofErr w:type="gramEnd"/>
       <w:r>
         <w:rPr>
           <w:rFonts w:cs="Calibri"/>
@@ -239,7 +217,6 @@
         </w:rPr>
         <w:t xml:space="preserve"> I </w:t>
       </w:r>
-      <w:proofErr w:type="spellStart"/>
       <w:r>
         <w:rPr>
           <w:b/>
@@ -249,33 +226,8 @@
           <w:sz w:val="20"/>
           <w:szCs w:val="20"/>
         </w:rPr>
-        <w:t>Declaration</w:t>
+        <w:t>Declaration and Transparency</w:t>
       </w:r>
-      <w:proofErr w:type="spellEnd"/>
-      <w:r>
-        <w:rPr>
-          <w:b/>
-          <w:bCs/>
-          <w:i/>
-          <w:iCs/>
-          <w:sz w:val="20"/>
-          <w:szCs w:val="20"/>
-        </w:rPr>
-        <w:t xml:space="preserve"> and </w:t>
-      </w:r>
-      <w:proofErr w:type="spellStart"/>
-      <w:r>
-        <w:rPr>
-          <w:b/>
-          <w:bCs/>
-          <w:i/>
-          <w:iCs/>
-          <w:sz w:val="20"/>
-          <w:szCs w:val="20"/>
-        </w:rPr>
-        <w:t>Transparency</w:t>
-      </w:r>
-      <w:proofErr w:type="spellEnd"/>
     </w:p>
     <w:tbl>
       <w:tblPr>
@@ -575,9 +527,11 @@
                 <w:r>
                   <w:rPr>
                     <w:rFonts w:ascii="Segoe UI Symbol" w:eastAsia="MS Gothic" w:hAnsi="Segoe UI Symbol" w:cs="Segoe UI Symbol"/>
+                    <w:b/>
+                    <w:bCs/>
                     <w:szCs w:val="20"/>
                   </w:rPr>
-                  <w:t>☐</w:t>
+                  <w:t>☑</w:t>
                 </w:r>
               </w:sdtContent>
             </w:sdt>
@@ -673,13 +627,26 @@
                 <w:id w:val="-706018228"/>
               </w:sdtPr>
               <w:sdtContent>
-                <w:r>
-                  <w:rPr>
-                    <w:rFonts w:ascii="Segoe UI Symbol" w:eastAsia="MS Gothic" w:hAnsi="Segoe UI Symbol" w:cs="Segoe UI Symbol"/>
-                    <w:szCs w:val="20"/>
-                  </w:rPr>
-                  <w:t>☐</w:t>
-                </w:r>
+                <w:sdt>
+                  <w:sdtPr>
+                    <w:rPr>
+                      <w:rFonts w:cstheme="minorHAnsi"/>
+                      <w:szCs w:val="20"/>
+                    </w:rPr>
+                    <w:id w:val="-1775468448"/>
+                  </w:sdtPr>
+                  <w:sdtContent>
+                    <w:r>
+                      <w:rPr>
+                        <w:rFonts w:ascii="Segoe UI Symbol" w:eastAsia="MS Gothic" w:hAnsi="Segoe UI Symbol" w:cs="Segoe UI Symbol"/>
+                        <w:b/>
+                        <w:bCs/>
+                        <w:szCs w:val="20"/>
+                      </w:rPr>
+                      <w:t>☑</w:t>
+                    </w:r>
+                  </w:sdtContent>
+                </w:sdt>
               </w:sdtContent>
             </w:sdt>
           </w:p>
@@ -734,51 +701,7 @@
                 <w:szCs w:val="20"/>
                 <w:lang w:val="en-US"/>
               </w:rPr>
-              <w:t xml:space="preserve">I have clearly described the purpose for which </w:t>
-            </w:r>
-            <w:proofErr w:type="gramStart"/>
-            <w:r>
-              <w:rPr>
-                <w:i/>
-                <w:iCs/>
-                <w:sz w:val="20"/>
-                <w:szCs w:val="20"/>
-                <w:lang w:val="en-US"/>
-              </w:rPr>
-              <w:t>the AI</w:t>
-            </w:r>
-            <w:proofErr w:type="gramEnd"/>
-            <w:r>
-              <w:rPr>
-                <w:i/>
-                <w:iCs/>
-                <w:sz w:val="20"/>
-                <w:szCs w:val="20"/>
-                <w:lang w:val="en-US"/>
-              </w:rPr>
-              <w:t xml:space="preserve"> was used (e.g. linguistic review, analysis support, preliminary </w:t>
-            </w:r>
-            <w:proofErr w:type="spellStart"/>
-            <w:r>
-              <w:rPr>
-                <w:i/>
-                <w:iCs/>
-                <w:sz w:val="20"/>
-                <w:szCs w:val="20"/>
-                <w:lang w:val="en-US"/>
-              </w:rPr>
-              <w:t>organisation</w:t>
-            </w:r>
-            <w:proofErr w:type="spellEnd"/>
-            <w:r>
-              <w:rPr>
-                <w:i/>
-                <w:iCs/>
-                <w:sz w:val="20"/>
-                <w:szCs w:val="20"/>
-                <w:lang w:val="en-US"/>
-              </w:rPr>
-              <w:t>, data simulation)</w:t>
+              <w:t>I have clearly described the purpose for which the AI was used (e.g. linguistic review, analysis support, preliminary organisation, data simulation)</w:t>
             </w:r>
             <w:r>
               <w:rPr>
@@ -816,13 +739,26 @@
                 <w:id w:val="777682099"/>
               </w:sdtPr>
               <w:sdtContent>
-                <w:r>
-                  <w:rPr>
-                    <w:rFonts w:ascii="Segoe UI Symbol" w:eastAsia="MS Gothic" w:hAnsi="Segoe UI Symbol" w:cs="Segoe UI Symbol"/>
-                    <w:szCs w:val="20"/>
-                  </w:rPr>
-                  <w:t>☐</w:t>
-                </w:r>
+                <w:sdt>
+                  <w:sdtPr>
+                    <w:rPr>
+                      <w:rFonts w:cstheme="minorHAnsi"/>
+                      <w:szCs w:val="20"/>
+                    </w:rPr>
+                    <w:id w:val="788097496"/>
+                  </w:sdtPr>
+                  <w:sdtContent>
+                    <w:r>
+                      <w:rPr>
+                        <w:rFonts w:ascii="Segoe UI Symbol" w:eastAsia="MS Gothic" w:hAnsi="Segoe UI Symbol" w:cs="Segoe UI Symbol"/>
+                        <w:b/>
+                        <w:bCs/>
+                        <w:szCs w:val="20"/>
+                      </w:rPr>
+                      <w:t>☑</w:t>
+                    </w:r>
+                  </w:sdtContent>
+                </w:sdt>
               </w:sdtContent>
             </w:sdt>
           </w:p>
@@ -854,7 +790,6 @@
         </w:rPr>
         <w:t xml:space="preserve"> I </w:t>
       </w:r>
-      <w:proofErr w:type="spellStart"/>
       <w:r>
         <w:rPr>
           <w:b/>
@@ -864,33 +799,8 @@
           <w:sz w:val="20"/>
           <w:szCs w:val="20"/>
         </w:rPr>
-        <w:t>Authorship</w:t>
+        <w:t>Authorship and Responsibility</w:t>
       </w:r>
-      <w:proofErr w:type="spellEnd"/>
-      <w:r>
-        <w:rPr>
-          <w:b/>
-          <w:bCs/>
-          <w:i/>
-          <w:iCs/>
-          <w:sz w:val="20"/>
-          <w:szCs w:val="20"/>
-        </w:rPr>
-        <w:t xml:space="preserve"> and </w:t>
-      </w:r>
-      <w:proofErr w:type="spellStart"/>
-      <w:r>
-        <w:rPr>
-          <w:b/>
-          <w:bCs/>
-          <w:i/>
-          <w:iCs/>
-          <w:sz w:val="20"/>
-          <w:szCs w:val="20"/>
-        </w:rPr>
-        <w:t>Responsibility</w:t>
-      </w:r>
-      <w:proofErr w:type="spellEnd"/>
     </w:p>
     <w:tbl>
       <w:tblPr>
@@ -999,13 +909,26 @@
                     <w:szCs w:val="20"/>
                   </w:rPr>
                 </w:pPr>
-                <w:r>
-                  <w:rPr>
-                    <w:rFonts w:ascii="Segoe UI Symbol" w:eastAsia="MS Gothic" w:hAnsi="Segoe UI Symbol" w:cs="Segoe UI Symbol"/>
-                    <w:szCs w:val="20"/>
-                  </w:rPr>
-                  <w:t>☐</w:t>
-                </w:r>
+                <w:sdt>
+                  <w:sdtPr>
+                    <w:rPr>
+                      <w:rFonts w:cstheme="minorHAnsi"/>
+                      <w:szCs w:val="20"/>
+                    </w:rPr>
+                    <w:id w:val="-899978250"/>
+                  </w:sdtPr>
+                  <w:sdtContent>
+                    <w:r>
+                      <w:rPr>
+                        <w:rFonts w:ascii="Segoe UI Symbol" w:eastAsia="MS Gothic" w:hAnsi="Segoe UI Symbol" w:cs="Segoe UI Symbol"/>
+                        <w:b/>
+                        <w:bCs/>
+                        <w:szCs w:val="20"/>
+                      </w:rPr>
+                      <w:t>☑</w:t>
+                    </w:r>
+                  </w:sdtContent>
+                </w:sdt>
               </w:p>
             </w:tc>
           </w:sdtContent>
@@ -1041,7 +964,6 @@
         </w:rPr>
         <w:t xml:space="preserve"> I </w:t>
       </w:r>
-      <w:proofErr w:type="spellStart"/>
       <w:r>
         <w:rPr>
           <w:rFonts w:cs="Calibri"/>
@@ -1052,87 +974,8 @@
           <w:sz w:val="20"/>
           <w:szCs w:val="20"/>
         </w:rPr>
-        <w:t>The</w:t>
+        <w:t>The Use of AI in Writing and Scientific Content</w:t>
       </w:r>
-      <w:proofErr w:type="spellEnd"/>
-      <w:r>
-        <w:rPr>
-          <w:rFonts w:cs="Calibri"/>
-          <w:b/>
-          <w:bCs/>
-          <w:i/>
-          <w:iCs/>
-          <w:sz w:val="20"/>
-          <w:szCs w:val="20"/>
-        </w:rPr>
-        <w:t xml:space="preserve"> Use of AI in </w:t>
-      </w:r>
-      <w:proofErr w:type="spellStart"/>
-      <w:r>
-        <w:rPr>
-          <w:rFonts w:cs="Calibri"/>
-          <w:b/>
-          <w:bCs/>
-          <w:i/>
-          <w:iCs/>
-          <w:sz w:val="20"/>
-          <w:szCs w:val="20"/>
-        </w:rPr>
-        <w:t>Writing</w:t>
-      </w:r>
-      <w:proofErr w:type="spellEnd"/>
-      <w:r>
-        <w:rPr>
-          <w:rFonts w:cs="Calibri"/>
-          <w:b/>
-          <w:bCs/>
-          <w:i/>
-          <w:iCs/>
-          <w:sz w:val="20"/>
-          <w:szCs w:val="20"/>
-        </w:rPr>
-        <w:t xml:space="preserve"> and </w:t>
-      </w:r>
-      <w:proofErr w:type="spellStart"/>
-      <w:r>
-        <w:rPr>
-          <w:rFonts w:cs="Calibri"/>
-          <w:b/>
-          <w:bCs/>
-          <w:i/>
-          <w:iCs/>
-          <w:sz w:val="20"/>
-          <w:szCs w:val="20"/>
-        </w:rPr>
-        <w:t>Scientific</w:t>
-      </w:r>
-      <w:proofErr w:type="spellEnd"/>
-      <w:r>
-        <w:rPr>
-          <w:rFonts w:cs="Calibri"/>
-          <w:b/>
-          <w:bCs/>
-          <w:i/>
-          <w:iCs/>
-          <w:sz w:val="20"/>
-          <w:szCs w:val="20"/>
-        </w:rPr>
-        <w:t xml:space="preserve"> </w:t>
-      </w:r>
-      <w:proofErr w:type="spellStart"/>
-      <w:r>
-        <w:rPr>
-          <w:rFonts w:cs="Calibri"/>
-          <w:b/>
-          <w:bCs/>
-          <w:i/>
-          <w:iCs/>
-          <w:sz w:val="20"/>
-          <w:szCs w:val="20"/>
-        </w:rPr>
-        <w:t>Content</w:t>
-      </w:r>
-      <w:proofErr w:type="spellEnd"/>
     </w:p>
     <w:tbl>
       <w:tblPr>
@@ -1245,13 +1088,26 @@
                     <w:szCs w:val="20"/>
                   </w:rPr>
                 </w:pPr>
-                <w:r>
-                  <w:rPr>
-                    <w:rFonts w:ascii="Segoe UI Symbol" w:eastAsia="MS Gothic" w:hAnsi="Segoe UI Symbol" w:cs="Segoe UI Symbol"/>
-                    <w:szCs w:val="20"/>
-                  </w:rPr>
-                  <w:t>☐</w:t>
-                </w:r>
+                <w:sdt>
+                  <w:sdtPr>
+                    <w:rPr>
+                      <w:rFonts w:cstheme="minorHAnsi"/>
+                      <w:szCs w:val="20"/>
+                    </w:rPr>
+                    <w:id w:val="-968742341"/>
+                  </w:sdtPr>
+                  <w:sdtContent>
+                    <w:r>
+                      <w:rPr>
+                        <w:rFonts w:ascii="Segoe UI Symbol" w:eastAsia="MS Gothic" w:hAnsi="Segoe UI Symbol" w:cs="Segoe UI Symbol"/>
+                        <w:b/>
+                        <w:bCs/>
+                        <w:szCs w:val="20"/>
+                      </w:rPr>
+                      <w:t>☑</w:t>
+                    </w:r>
+                  </w:sdtContent>
+                </w:sdt>
               </w:p>
             </w:tc>
           </w:sdtContent>
@@ -1340,13 +1196,26 @@
                 <w:id w:val="-826748364"/>
               </w:sdtPr>
               <w:sdtContent>
-                <w:r>
-                  <w:rPr>
-                    <w:rFonts w:ascii="Segoe UI Symbol" w:eastAsia="MS Gothic" w:hAnsi="Segoe UI Symbol" w:cs="Segoe UI Symbol"/>
-                    <w:szCs w:val="20"/>
-                  </w:rPr>
-                  <w:t>☐</w:t>
-                </w:r>
+                <w:sdt>
+                  <w:sdtPr>
+                    <w:rPr>
+                      <w:rFonts w:cstheme="minorHAnsi"/>
+                      <w:szCs w:val="20"/>
+                    </w:rPr>
+                    <w:id w:val="1383909161"/>
+                  </w:sdtPr>
+                  <w:sdtContent>
+                    <w:r>
+                      <w:rPr>
+                        <w:rFonts w:ascii="Segoe UI Symbol" w:eastAsia="MS Gothic" w:hAnsi="Segoe UI Symbol" w:cs="Segoe UI Symbol"/>
+                        <w:b/>
+                        <w:bCs/>
+                        <w:szCs w:val="20"/>
+                      </w:rPr>
+                      <w:t>☑</w:t>
+                    </w:r>
+                  </w:sdtContent>
+                </w:sdt>
               </w:sdtContent>
             </w:sdt>
           </w:p>
@@ -1439,7 +1308,7 @@
                     <w:rFonts w:ascii="Segoe UI Symbol" w:eastAsia="MS Gothic" w:hAnsi="Segoe UI Symbol" w:cs="Segoe UI Symbol"/>
                     <w:szCs w:val="20"/>
                   </w:rPr>
-                  <w:t>☐</w:t>
+                  <w:t>☑</w:t>
                 </w:r>
               </w:sdtContent>
             </w:sdt>
@@ -1507,79 +1376,7 @@
           <w:sz w:val="20"/>
           <w:szCs w:val="20"/>
         </w:rPr>
-        <w:t xml:space="preserve">AI as </w:t>
-      </w:r>
-      <w:proofErr w:type="spellStart"/>
-      <w:r>
-        <w:rPr>
-          <w:b/>
-          <w:bCs/>
-          <w:i/>
-          <w:iCs/>
-          <w:sz w:val="20"/>
-          <w:szCs w:val="20"/>
-        </w:rPr>
-        <w:t>Part</w:t>
-      </w:r>
-      <w:proofErr w:type="spellEnd"/>
-      <w:r>
-        <w:rPr>
-          <w:b/>
-          <w:bCs/>
-          <w:i/>
-          <w:iCs/>
-          <w:sz w:val="20"/>
-          <w:szCs w:val="20"/>
-        </w:rPr>
-        <w:t xml:space="preserve"> of </w:t>
-      </w:r>
-      <w:proofErr w:type="spellStart"/>
-      <w:r>
-        <w:rPr>
-          <w:b/>
-          <w:bCs/>
-          <w:i/>
-          <w:iCs/>
-          <w:sz w:val="20"/>
-          <w:szCs w:val="20"/>
-        </w:rPr>
-        <w:t>the</w:t>
-      </w:r>
-      <w:proofErr w:type="spellEnd"/>
-      <w:r>
-        <w:rPr>
-          <w:b/>
-          <w:bCs/>
-          <w:i/>
-          <w:iCs/>
-          <w:sz w:val="20"/>
-          <w:szCs w:val="20"/>
-        </w:rPr>
-        <w:t xml:space="preserve"> </w:t>
-      </w:r>
-      <w:proofErr w:type="spellStart"/>
-      <w:r>
-        <w:rPr>
-          <w:b/>
-          <w:bCs/>
-          <w:i/>
-          <w:iCs/>
-          <w:sz w:val="20"/>
-          <w:szCs w:val="20"/>
-        </w:rPr>
-        <w:t>Method</w:t>
-      </w:r>
-      <w:proofErr w:type="spellEnd"/>
-      <w:r>
-        <w:rPr>
-          <w:b/>
-          <w:bCs/>
-          <w:i/>
-          <w:iCs/>
-          <w:sz w:val="20"/>
-          <w:szCs w:val="20"/>
-        </w:rPr>
-        <w:t xml:space="preserve"> </w:t>
+        <w:t xml:space="preserve">AI as Part of the Method </w:t>
       </w:r>
       <w:r>
         <w:rPr>
@@ -1588,87 +1385,7 @@
           <w:sz w:val="20"/>
           <w:szCs w:val="20"/>
         </w:rPr>
-        <w:t>(</w:t>
-      </w:r>
-      <w:proofErr w:type="spellStart"/>
-      <w:r>
-        <w:rPr>
-          <w:i/>
-          <w:iCs/>
-          <w:sz w:val="20"/>
-          <w:szCs w:val="20"/>
-        </w:rPr>
-        <w:t>Tick</w:t>
-      </w:r>
-      <w:proofErr w:type="spellEnd"/>
-      <w:r>
-        <w:rPr>
-          <w:i/>
-          <w:iCs/>
-          <w:sz w:val="20"/>
-          <w:szCs w:val="20"/>
-        </w:rPr>
-        <w:t xml:space="preserve"> </w:t>
-      </w:r>
-      <w:proofErr w:type="spellStart"/>
-      <w:r>
-        <w:rPr>
-          <w:i/>
-          <w:iCs/>
-          <w:sz w:val="20"/>
-          <w:szCs w:val="20"/>
-        </w:rPr>
-        <w:t>only</w:t>
-      </w:r>
-      <w:proofErr w:type="spellEnd"/>
-      <w:r>
-        <w:rPr>
-          <w:i/>
-          <w:iCs/>
-          <w:sz w:val="20"/>
-          <w:szCs w:val="20"/>
-        </w:rPr>
-        <w:t xml:space="preserve"> </w:t>
-      </w:r>
-      <w:proofErr w:type="spellStart"/>
-      <w:r>
-        <w:rPr>
-          <w:i/>
-          <w:iCs/>
-          <w:sz w:val="20"/>
-          <w:szCs w:val="20"/>
-        </w:rPr>
-        <w:t>if</w:t>
-      </w:r>
-      <w:proofErr w:type="spellEnd"/>
-      <w:r>
-        <w:rPr>
-          <w:i/>
-          <w:iCs/>
-          <w:sz w:val="20"/>
-          <w:szCs w:val="20"/>
-        </w:rPr>
-        <w:t xml:space="preserve"> </w:t>
-      </w:r>
-      <w:proofErr w:type="spellStart"/>
-      <w:r>
-        <w:rPr>
-          <w:i/>
-          <w:iCs/>
-          <w:sz w:val="20"/>
-          <w:szCs w:val="20"/>
-        </w:rPr>
-        <w:t>applicable</w:t>
-      </w:r>
-      <w:proofErr w:type="spellEnd"/>
-      <w:r>
-        <w:rPr>
-          <w:i/>
-          <w:iCs/>
-          <w:sz w:val="20"/>
-          <w:szCs w:val="20"/>
-        </w:rPr>
-        <w:t>)</w:t>
+        <w:t>(Tick only if applicable)</w:t>
       </w:r>
     </w:p>
     <w:tbl>
@@ -1761,13 +1478,26 @@
                     <w:szCs w:val="20"/>
                   </w:rPr>
                 </w:pPr>
-                <w:r>
-                  <w:rPr>
-                    <w:rFonts w:ascii="Segoe UI Symbol" w:eastAsia="MS Gothic" w:hAnsi="Segoe UI Symbol" w:cs="Segoe UI Symbol"/>
-                    <w:szCs w:val="20"/>
-                  </w:rPr>
-                  <w:t>☐</w:t>
-                </w:r>
+                <w:sdt>
+                  <w:sdtPr>
+                    <w:rPr>
+                      <w:rFonts w:cstheme="minorHAnsi"/>
+                      <w:szCs w:val="20"/>
+                    </w:rPr>
+                    <w:id w:val="-1066182584"/>
+                  </w:sdtPr>
+                  <w:sdtContent>
+                    <w:r>
+                      <w:rPr>
+                        <w:rFonts w:ascii="Segoe UI Symbol" w:eastAsia="MS Gothic" w:hAnsi="Segoe UI Symbol" w:cs="Segoe UI Symbol"/>
+                        <w:b/>
+                        <w:bCs/>
+                        <w:szCs w:val="20"/>
+                      </w:rPr>
+                      <w:t>☑</w:t>
+                    </w:r>
+                  </w:sdtContent>
+                </w:sdt>
               </w:p>
             </w:tc>
           </w:sdtContent>
@@ -1851,13 +1581,26 @@
                 <w:id w:val="-381486741"/>
               </w:sdtPr>
               <w:sdtContent>
-                <w:r>
-                  <w:rPr>
-                    <w:rFonts w:ascii="Segoe UI Symbol" w:eastAsia="MS Gothic" w:hAnsi="Segoe UI Symbol" w:cs="Segoe UI Symbol"/>
-                    <w:szCs w:val="20"/>
-                  </w:rPr>
-                  <w:t>☐</w:t>
-                </w:r>
+                <w:sdt>
+                  <w:sdtPr>
+                    <w:rPr>
+                      <w:rFonts w:cstheme="minorHAnsi"/>
+                      <w:szCs w:val="20"/>
+                    </w:rPr>
+                    <w:id w:val="1185097223"/>
+                  </w:sdtPr>
+                  <w:sdtContent>
+                    <w:r>
+                      <w:rPr>
+                        <w:rFonts w:ascii="Segoe UI Symbol" w:eastAsia="MS Gothic" w:hAnsi="Segoe UI Symbol" w:cs="Segoe UI Symbol"/>
+                        <w:b/>
+                        <w:bCs/>
+                        <w:szCs w:val="20"/>
+                      </w:rPr>
+                      <w:t>☑</w:t>
+                    </w:r>
+                  </w:sdtContent>
+                </w:sdt>
               </w:sdtContent>
             </w:sdt>
           </w:p>
@@ -1940,7 +1683,7 @@
                     <w:rFonts w:ascii="Segoe UI Symbol" w:eastAsia="MS Gothic" w:hAnsi="Segoe UI Symbol" w:cs="Segoe UI Symbol"/>
                     <w:szCs w:val="20"/>
                   </w:rPr>
-                  <w:t>☐</w:t>
+                  <w:t>☑</w:t>
                 </w:r>
               </w:sdtContent>
             </w:sdt>
@@ -1999,7 +1742,6 @@
         </w:rPr>
         <w:t xml:space="preserve">I </w:t>
       </w:r>
-      <w:proofErr w:type="spellStart"/>
       <w:r>
         <w:rPr>
           <w:b/>
@@ -2009,67 +1751,7 @@
           <w:sz w:val="20"/>
           <w:szCs w:val="20"/>
         </w:rPr>
-        <w:t>Qualitative</w:t>
-      </w:r>
-      <w:proofErr w:type="spellEnd"/>
-      <w:r>
-        <w:rPr>
-          <w:b/>
-          <w:bCs/>
-          <w:i/>
-          <w:iCs/>
-          <w:sz w:val="20"/>
-          <w:szCs w:val="20"/>
-        </w:rPr>
-        <w:t xml:space="preserve"> Research, </w:t>
-      </w:r>
-      <w:proofErr w:type="spellStart"/>
-      <w:r>
-        <w:rPr>
-          <w:b/>
-          <w:bCs/>
-          <w:i/>
-          <w:iCs/>
-          <w:sz w:val="20"/>
-          <w:szCs w:val="20"/>
-        </w:rPr>
-        <w:t>Interviews</w:t>
-      </w:r>
-      <w:proofErr w:type="spellEnd"/>
-      <w:r>
-        <w:rPr>
-          <w:b/>
-          <w:bCs/>
-          <w:i/>
-          <w:iCs/>
-          <w:sz w:val="20"/>
-          <w:szCs w:val="20"/>
-        </w:rPr>
-        <w:t xml:space="preserve"> and </w:t>
-      </w:r>
-      <w:proofErr w:type="spellStart"/>
-      <w:r>
-        <w:rPr>
-          <w:b/>
-          <w:bCs/>
-          <w:i/>
-          <w:iCs/>
-          <w:sz w:val="20"/>
-          <w:szCs w:val="20"/>
-        </w:rPr>
-        <w:t>Ethnography</w:t>
-      </w:r>
-      <w:proofErr w:type="spellEnd"/>
-      <w:r>
-        <w:rPr>
-          <w:b/>
-          <w:bCs/>
-          <w:i/>
-          <w:iCs/>
-          <w:sz w:val="20"/>
-          <w:szCs w:val="20"/>
-        </w:rPr>
-        <w:t xml:space="preserve"> </w:t>
+        <w:t xml:space="preserve">Qualitative Research, Interviews and Ethnography </w:t>
       </w:r>
       <w:r>
         <w:rPr>
@@ -2078,87 +1760,7 @@
           <w:sz w:val="20"/>
           <w:szCs w:val="20"/>
         </w:rPr>
-        <w:t>(</w:t>
-      </w:r>
-      <w:proofErr w:type="spellStart"/>
-      <w:r>
-        <w:rPr>
-          <w:i/>
-          <w:iCs/>
-          <w:sz w:val="20"/>
-          <w:szCs w:val="20"/>
-        </w:rPr>
-        <w:t>Tick</w:t>
-      </w:r>
-      <w:proofErr w:type="spellEnd"/>
-      <w:r>
-        <w:rPr>
-          <w:i/>
-          <w:iCs/>
-          <w:sz w:val="20"/>
-          <w:szCs w:val="20"/>
-        </w:rPr>
-        <w:t xml:space="preserve"> </w:t>
-      </w:r>
-      <w:proofErr w:type="spellStart"/>
-      <w:r>
-        <w:rPr>
-          <w:i/>
-          <w:iCs/>
-          <w:sz w:val="20"/>
-          <w:szCs w:val="20"/>
-        </w:rPr>
-        <w:t>only</w:t>
-      </w:r>
-      <w:proofErr w:type="spellEnd"/>
-      <w:r>
-        <w:rPr>
-          <w:i/>
-          <w:iCs/>
-          <w:sz w:val="20"/>
-          <w:szCs w:val="20"/>
-        </w:rPr>
-        <w:t xml:space="preserve"> </w:t>
-      </w:r>
-      <w:proofErr w:type="spellStart"/>
-      <w:r>
-        <w:rPr>
-          <w:i/>
-          <w:iCs/>
-          <w:sz w:val="20"/>
-          <w:szCs w:val="20"/>
-        </w:rPr>
-        <w:t>if</w:t>
-      </w:r>
-      <w:proofErr w:type="spellEnd"/>
-      <w:r>
-        <w:rPr>
-          <w:i/>
-          <w:iCs/>
-          <w:sz w:val="20"/>
-          <w:szCs w:val="20"/>
-        </w:rPr>
-        <w:t xml:space="preserve"> </w:t>
-      </w:r>
-      <w:proofErr w:type="spellStart"/>
-      <w:r>
-        <w:rPr>
-          <w:i/>
-          <w:iCs/>
-          <w:sz w:val="20"/>
-          <w:szCs w:val="20"/>
-        </w:rPr>
-        <w:t>applicable</w:t>
-      </w:r>
-      <w:proofErr w:type="spellEnd"/>
-      <w:r>
-        <w:rPr>
-          <w:i/>
-          <w:iCs/>
-          <w:sz w:val="20"/>
-          <w:szCs w:val="20"/>
-        </w:rPr>
-        <w:t>)</w:t>
+        <w:t>(Tick only if applicable)</w:t>
       </w:r>
     </w:p>
     <w:tbl>
@@ -2266,7 +1868,7 @@
                     <w:rFonts w:ascii="Segoe UI Symbol" w:eastAsia="MS Gothic" w:hAnsi="Segoe UI Symbol" w:cs="Segoe UI Symbol"/>
                     <w:szCs w:val="20"/>
                   </w:rPr>
-                  <w:t>☐</w:t>
+                  <w:t>☑</w:t>
                 </w:r>
               </w:p>
             </w:tc>
@@ -2356,7 +1958,7 @@
                     <w:rFonts w:ascii="Segoe UI Symbol" w:eastAsia="MS Gothic" w:hAnsi="Segoe UI Symbol" w:cs="Segoe UI Symbol"/>
                     <w:szCs w:val="20"/>
                   </w:rPr>
-                  <w:t>☐</w:t>
+                  <w:t>☑</w:t>
                 </w:r>
               </w:sdtContent>
             </w:sdt>
@@ -2521,7 +2123,7 @@
                     <w:rFonts w:ascii="Segoe UI Symbol" w:eastAsia="MS Gothic" w:hAnsi="Segoe UI Symbol" w:cs="Segoe UI Symbol"/>
                     <w:szCs w:val="20"/>
                   </w:rPr>
-                  <w:t>☐</w:t>
+                  <w:t>☑</w:t>
                 </w:r>
               </w:sdtContent>
             </w:sdt>
@@ -2619,7 +2221,7 @@
                     <w:rFonts w:ascii="Segoe UI Symbol" w:eastAsia="MS Gothic" w:hAnsi="Segoe UI Symbol" w:cs="Segoe UI Symbol"/>
                     <w:szCs w:val="20"/>
                   </w:rPr>
-                  <w:t>☐</w:t>
+                  <w:t>☑</w:t>
                 </w:r>
               </w:sdtContent>
             </w:sdt>
@@ -2705,7 +2307,7 @@
                     <w:rFonts w:ascii="Segoe UI Symbol" w:eastAsia="MS Gothic" w:hAnsi="Segoe UI Symbol" w:cs="Segoe UI Symbol"/>
                     <w:szCs w:val="20"/>
                   </w:rPr>
-                  <w:t>☐</w:t>
+                  <w:t>☑</w:t>
                 </w:r>
               </w:sdtContent>
             </w:sdt>
@@ -2747,45 +2349,8 @@
           <w:sz w:val="20"/>
           <w:szCs w:val="20"/>
         </w:rPr>
-        <w:t xml:space="preserve">Data </w:t>
+        <w:t>Data Protection and Ethics</w:t>
       </w:r>
-      <w:proofErr w:type="spellStart"/>
-      <w:r>
-        <w:rPr>
-          <w:b/>
-          <w:bCs/>
-          <w:i/>
-          <w:iCs/>
-          <w:sz w:val="20"/>
-          <w:szCs w:val="20"/>
-        </w:rPr>
-        <w:t>Protection</w:t>
-      </w:r>
-      <w:proofErr w:type="spellEnd"/>
-      <w:r>
-        <w:rPr>
-          <w:b/>
-          <w:bCs/>
-          <w:i/>
-          <w:iCs/>
-          <w:sz w:val="20"/>
-          <w:szCs w:val="20"/>
-        </w:rPr>
-        <w:t xml:space="preserve"> and </w:t>
-      </w:r>
-      <w:proofErr w:type="spellStart"/>
-      <w:r>
-        <w:rPr>
-          <w:b/>
-          <w:bCs/>
-          <w:i/>
-          <w:iCs/>
-          <w:sz w:val="20"/>
-          <w:szCs w:val="20"/>
-        </w:rPr>
-        <w:t>Ethics</w:t>
-      </w:r>
-      <w:proofErr w:type="spellEnd"/>
     </w:p>
     <w:tbl>
       <w:tblPr>
@@ -2892,7 +2457,7 @@
                     <w:rFonts w:ascii="Segoe UI Symbol" w:eastAsia="MS Gothic" w:hAnsi="Segoe UI Symbol" w:cs="Segoe UI Symbol"/>
                     <w:szCs w:val="20"/>
                   </w:rPr>
-                  <w:t>☐</w:t>
+                  <w:t>☑</w:t>
                 </w:r>
               </w:p>
             </w:tc>
@@ -2984,7 +2549,7 @@
                     <w:rFonts w:ascii="Segoe UI Symbol" w:eastAsia="MS Gothic" w:hAnsi="Segoe UI Symbol" w:cs="Segoe UI Symbol"/>
                     <w:szCs w:val="20"/>
                   </w:rPr>
-                  <w:t>☐</w:t>
+                  <w:t>☑</w:t>
                 </w:r>
               </w:p>
             </w:tc>
@@ -3068,51 +2633,7 @@
           <w:sz w:val="20"/>
           <w:szCs w:val="20"/>
         </w:rPr>
-        <w:t xml:space="preserve">I </w:t>
-      </w:r>
-      <w:proofErr w:type="spellStart"/>
-      <w:r>
-        <w:rPr>
-          <w:rFonts w:asciiTheme="minorHAnsi" w:hAnsiTheme="minorHAnsi" w:cstheme="minorHAnsi"/>
-          <w:i/>
-          <w:iCs/>
-          <w:sz w:val="20"/>
-          <w:szCs w:val="20"/>
-        </w:rPr>
-        <w:t>hereby</w:t>
-      </w:r>
-      <w:proofErr w:type="spellEnd"/>
-      <w:r>
-        <w:rPr>
-          <w:rFonts w:asciiTheme="minorHAnsi" w:hAnsiTheme="minorHAnsi" w:cstheme="minorHAnsi"/>
-          <w:i/>
-          <w:iCs/>
-          <w:sz w:val="20"/>
-          <w:szCs w:val="20"/>
-        </w:rPr>
-        <w:t xml:space="preserve"> declare </w:t>
-      </w:r>
-      <w:proofErr w:type="spellStart"/>
-      <w:r>
-        <w:rPr>
-          <w:rFonts w:asciiTheme="minorHAnsi" w:hAnsiTheme="minorHAnsi" w:cstheme="minorHAnsi"/>
-          <w:i/>
-          <w:iCs/>
-          <w:sz w:val="20"/>
-          <w:szCs w:val="20"/>
-        </w:rPr>
-        <w:t>that</w:t>
-      </w:r>
-      <w:proofErr w:type="spellEnd"/>
-      <w:r>
-        <w:rPr>
-          <w:rFonts w:asciiTheme="minorHAnsi" w:hAnsiTheme="minorHAnsi" w:cstheme="minorHAnsi"/>
-          <w:i/>
-          <w:iCs/>
-          <w:sz w:val="20"/>
-          <w:szCs w:val="20"/>
-        </w:rPr>
-        <w:t>:</w:t>
+        <w:t>I hereby declare that:</w:t>
       </w:r>
     </w:p>
     <w:tbl>
@@ -3249,7 +2770,7 @@
                     <w:rFonts w:ascii="Segoe UI Symbol" w:eastAsia="MS Gothic" w:hAnsi="Segoe UI Symbol" w:cs="Segoe UI Symbol"/>
                     <w:szCs w:val="20"/>
                   </w:rPr>
-                  <w:t>☐</w:t>
+                  <w:t>☑</w:t>
                 </w:r>
               </w:p>
             </w:tc>
@@ -3366,7 +2887,7 @@
                     <w:rFonts w:ascii="Segoe UI Symbol" w:eastAsia="MS Gothic" w:hAnsi="Segoe UI Symbol" w:cs="Segoe UI Symbol"/>
                     <w:szCs w:val="20"/>
                   </w:rPr>
-                  <w:t>☐</w:t>
+                  <w:t>☑</w:t>
                 </w:r>
               </w:p>
             </w:tc>
@@ -3466,17 +2987,14 @@
                   <w:rFonts w:cstheme="minorHAnsi"/>
                 </w:rPr>
                 <w:id w:val="-1809785839"/>
-                <w:showingPlcHdr/>
                 <w:text w:multiLine="1"/>
               </w:sdtPr>
               <w:sdtContent>
                 <w:r>
                   <w:rPr>
-                    <w:rStyle w:val="PlaceholderText"/>
                     <w:rFonts w:cstheme="minorHAnsi"/>
-                    <w:lang w:val="en-US"/>
                   </w:rPr>
-                  <w:t>Click here to enter text.</w:t>
+                  <w:t>27/9/2026</w:t>
                 </w:r>
               </w:sdtContent>
             </w:sdt>
@@ -3510,7 +3028,6 @@
               </w:rPr>
               <w:t xml:space="preserve"> I </w:t>
             </w:r>
-            <w:proofErr w:type="spellStart"/>
             <w:r>
               <w:rPr>
                 <w:rFonts w:cstheme="minorHAnsi"/>
@@ -3521,7 +3038,6 @@
               </w:rPr>
               <w:t>Name</w:t>
             </w:r>
-            <w:proofErr w:type="spellEnd"/>
           </w:p>
         </w:tc>
         <w:sdt>
@@ -3530,7 +3046,6 @@
               <w:rFonts w:cstheme="minorHAnsi"/>
             </w:rPr>
             <w:id w:val="128214602"/>
-            <w:showingPlcHdr/>
             <w:text w:multiLine="1"/>
           </w:sdtPr>
           <w:sdtContent>
@@ -3544,16 +3059,19 @@
                 <w:pPr>
                   <w:rPr>
                     <w:rFonts w:cstheme="minorHAnsi"/>
-                    <w:lang w:val="en-US"/>
                   </w:rPr>
                 </w:pPr>
                 <w:r>
                   <w:rPr>
-                    <w:rStyle w:val="PlaceholderText"/>
                     <w:rFonts w:cstheme="minorHAnsi"/>
-                    <w:lang w:val="en-US"/>
                   </w:rPr>
-                  <w:t>Click here to enter text.</w:t>
+                  <w:t>João Filipe Silva de A</w:t>
+                </w:r>
+                <w:r>
+                  <w:rPr>
+                    <w:rFonts w:cstheme="minorHAnsi"/>
+                  </w:rPr>
+                  <w:t>lmeida</w:t>
                 </w:r>
               </w:p>
             </w:tc>
@@ -3568,7 +3086,6 @@
           <w:rFonts w:ascii="Montserrat" w:hAnsi="Montserrat" w:cs="Arial"/>
           <w:sz w:val="20"/>
           <w:szCs w:val="20"/>
-          <w:lang w:val="en-US"/>
         </w:rPr>
       </w:pPr>
     </w:p>
@@ -3580,7 +3097,6 @@
           <w:rFonts w:cs="Calibri"/>
           <w:b/>
           <w:bCs/>
-          <w:lang w:val="en-US"/>
         </w:rPr>
       </w:pPr>
     </w:p>
@@ -3597,7 +3113,7 @@
 </file>
 
 <file path=word/endnotes.xml><?xml version="1.0" encoding="utf-8"?>
-<w:endnotes xmlns:wpc="http://schemas.microsoft.com/office/word/2010/wordprocessingCanvas" xmlns:cx="http://schemas.microsoft.com/office/drawing/2014/chartex" xmlns:cx1="http://schemas.microsoft.com/office/drawing/2015/9/8/chartex" xmlns:cx2="http://schemas.microsoft.com/office/drawing/2015/10/21/chartex" xmlns:cx3="http://schemas.microsoft.com/office/drawing/2016/5/9/chartex" xmlns:cx4="http://schemas.microsoft.com/office/drawing/2016/5/10/chartex" xmlns:cx5="http://schemas.microsoft.com/office/drawing/2016/5/11/chartex" xmlns:cx6="http://schemas.microsoft.com/office/drawing/2016/5/12/chartex" xmlns:cx7="http://schemas.microsoft.com/office/drawing/2016/5/13/chartex" xmlns:cx8="http://schemas.microsoft.com/office/drawing/2016/5/14/chartex" xmlns:mc="http://schemas.openxmlformats.org/markup-compatibility/2006" xmlns:aink="http://schemas.microsoft.com/office/drawing/2016/ink" xmlns:am3d="http://schemas.microsoft.com/office/drawing/2017/model3d" xmlns:o="urn:schemas-microsoft-com:office:office" xmlns:oel="http://schemas.microsoft.com/office/2019/extlst" xmlns:r="http://schemas.openxmlformats.org/officeDocument/2006/relationships" xmlns:m="http://schemas.openxmlformats.org/officeDocument/2006/math" xmlns:v="urn:schemas-microsoft-com:vml" xmlns:wp14="http://schemas.microsoft.com/office/word/2010/wordprocessingDrawing" xmlns:wp="http://schemas.openxmlformats.org/drawingml/2006/wordprocessingDrawing" xmlns:w10="urn:schemas-microsoft-com:office:word" xmlns:w="http://schemas.openxmlformats.org/wordprocessingml/2006/main" xmlns:w14="http://schemas.microsoft.com/office/word/2010/wordml" xmlns:w15="http://schemas.microsoft.com/office/word/2012/wordml" xmlns:w16cei="http://schemas.microsoft.com/office/word/2026/wordml/cei" xmlns:w16cex="http://schemas.microsoft.com/office/word/2018/wordml/cex" xmlns:w16cid="http://schemas.microsoft.com/office/word/2016/wordml/cid" xmlns:w16="http://schemas.microsoft.com/office/word/2018/wordml" xmlns:w16du="http://schemas.microsoft.com/office/word/2023/wordml/word16du" xmlns:w16sdtdh="http://schemas.microsoft.com/office/word/2020/wordml/sdtdatahash" xmlns:w16sdtfl="http://schemas.microsoft.com/office/word/2024/wordml/sdtformatlock" xmlns:w16se="http://schemas.microsoft.com/office/word/2015/wordml/symex" xmlns:wpg="http://schemas.microsoft.com/office/word/2010/wordprocessingGroup" xmlns:wpi="http://schemas.microsoft.com/office/word/2010/wordprocessingInk" xmlns:wne="http://schemas.microsoft.com/office/word/2006/wordml" xmlns:wps="http://schemas.microsoft.com/office/word/2010/wordprocessingShape" mc:Ignorable="w14 w15 w16se w16cid w16 w16cex w16sdtdh w16sdtfl w16du wp14">
+<w:endnotes xmlns:wpc="http://schemas.microsoft.com/office/word/2010/wordprocessingCanvas" xmlns:cx="http://schemas.microsoft.com/office/drawing/2014/chartex" xmlns:cx1="http://schemas.microsoft.com/office/drawing/2015/9/8/chartex" xmlns:cx2="http://schemas.microsoft.com/office/drawing/2015/10/21/chartex" xmlns:cx3="http://schemas.microsoft.com/office/drawing/2016/5/9/chartex" xmlns:cx4="http://schemas.microsoft.com/office/drawing/2016/5/10/chartex" xmlns:cx5="http://schemas.microsoft.com/office/drawing/2016/5/11/chartex" xmlns:cx6="http://schemas.microsoft.com/office/drawing/2016/5/12/chartex" xmlns:cx7="http://schemas.microsoft.com/office/drawing/2016/5/13/chartex" xmlns:cx8="http://schemas.microsoft.com/office/drawing/2016/5/14/chartex" xmlns:mc="http://schemas.openxmlformats.org/markup-compatibility/2006" xmlns:aink="http://schemas.microsoft.com/office/drawing/2016/ink" xmlns:am3d="http://schemas.microsoft.com/office/drawing/2017/model3d" xmlns:o="urn:schemas-microsoft-com:office:office" xmlns:oel="http://schemas.microsoft.com/office/2019/extlst" xmlns:r="http://schemas.openxmlformats.org/officeDocument/2006/relationships" xmlns:m="http://schemas.openxmlformats.org/officeDocument/2006/math" xmlns:v="urn:schemas-microsoft-com:vml" xmlns:wp14="http://schemas.microsoft.com/office/word/2010/wordprocessingDrawing" xmlns:wp="http://schemas.openxmlformats.org/drawingml/2006/wordprocessingDrawing" xmlns:w10="urn:schemas-microsoft-com:office:word" xmlns:w="http://schemas.openxmlformats.org/wordprocessingml/2006/main" xmlns:w14="http://schemas.microsoft.com/office/word/2010/wordml" xmlns:w15="http://schemas.microsoft.com/office/word/2012/wordml" xmlns:w16cex="http://schemas.microsoft.com/office/word/2018/wordml/cex" xmlns:w16cid="http://schemas.microsoft.com/office/word/2016/wordml/cid" xmlns:w16="http://schemas.microsoft.com/office/word/2018/wordml" xmlns:w16du="http://schemas.microsoft.com/office/word/2023/wordml/word16du" xmlns:w16sdtdh="http://schemas.microsoft.com/office/word/2020/wordml/sdtdatahash" xmlns:w16sdtfl="http://schemas.microsoft.com/office/word/2024/wordml/sdtformatlock" xmlns:w16se="http://schemas.microsoft.com/office/word/2015/wordml/symex" xmlns:wpg="http://schemas.microsoft.com/office/word/2010/wordprocessingGroup" xmlns:wpi="http://schemas.microsoft.com/office/word/2010/wordprocessingInk" xmlns:wne="http://schemas.microsoft.com/office/word/2006/wordml" xmlns:wps="http://schemas.microsoft.com/office/word/2010/wordprocessingShape" mc:Ignorable="w14 w15 w16se w16cid w16 w16cex w16sdtdh w16sdtfl w16du wp14">
   <w:endnote w:type="separator" w:id="-1">
     <w:p>
       <w:pPr>
@@ -3629,7 +3145,7 @@
 </file>
 
 <file path=word/footer1.xml><?xml version="1.0" encoding="utf-8"?>
-<w:ftr xmlns:wpc="http://schemas.microsoft.com/office/word/2010/wordprocessingCanvas" xmlns:cx="http://schemas.microsoft.com/office/drawing/2014/chartex" xmlns:cx1="http://schemas.microsoft.com/office/drawing/2015/9/8/chartex" xmlns:cx2="http://schemas.microsoft.com/office/drawing/2015/10/21/chartex" xmlns:cx3="http://schemas.microsoft.com/office/drawing/2016/5/9/chartex" xmlns:cx4="http://schemas.microsoft.com/office/drawing/2016/5/10/chartex" xmlns:cx5="http://schemas.microsoft.com/office/drawing/2016/5/11/chartex" xmlns:cx6="http://schemas.microsoft.com/office/drawing/2016/5/12/chartex" xmlns:cx7="http://schemas.microsoft.com/office/drawing/2016/5/13/chartex" xmlns:cx8="http://schemas.microsoft.com/office/drawing/2016/5/14/chartex" xmlns:mc="http://schemas.openxmlformats.org/markup-compatibility/2006" xmlns:aink="http://schemas.microsoft.com/office/drawing/2016/ink" xmlns:am3d="http://schemas.microsoft.com/office/drawing/2017/model3d" xmlns:o="urn:schemas-microsoft-com:office:office" xmlns:oel="http://schemas.microsoft.com/office/2019/extlst" xmlns:r="http://schemas.openxmlformats.org/officeDocument/2006/relationships" xmlns:m="http://schemas.openxmlformats.org/officeDocument/2006/math" xmlns:v="urn:schemas-microsoft-com:vml" xmlns:wp14="http://schemas.microsoft.com/office/word/2010/wordprocessingDrawing" xmlns:wp="http://schemas.openxmlformats.org/drawingml/2006/wordprocessingDrawing" xmlns:w10="urn:schemas-microsoft-com:office:word" xmlns:w="http://schemas.openxmlformats.org/wordprocessingml/2006/main" xmlns:w14="http://schemas.microsoft.com/office/word/2010/wordml" xmlns:w15="http://schemas.microsoft.com/office/word/2012/wordml" xmlns:w16cei="http://schemas.microsoft.com/office/word/2026/wordml/cei" xmlns:w16cex="http://schemas.microsoft.com/office/word/2018/wordml/cex" xmlns:w16cid="http://schemas.microsoft.com/office/word/2016/wordml/cid" xmlns:w16="http://schemas.microsoft.com/office/word/2018/wordml" xmlns:w16du="http://schemas.microsoft.com/office/word/2023/wordml/word16du" xmlns:w16sdtdh="http://schemas.microsoft.com/office/word/2020/wordml/sdtdatahash" xmlns:w16sdtfl="http://schemas.microsoft.com/office/word/2024/wordml/sdtformatlock" xmlns:w16se="http://schemas.microsoft.com/office/word/2015/wordml/symex" xmlns:wpg="http://schemas.microsoft.com/office/word/2010/wordprocessingGroup" xmlns:wpi="http://schemas.microsoft.com/office/word/2010/wordprocessingInk" xmlns:wne="http://schemas.microsoft.com/office/word/2006/wordml" xmlns:wps="http://schemas.microsoft.com/office/word/2010/wordprocessingShape" mc:Ignorable="w14 w15 w16se w16cid w16 w16cex w16sdtdh w16sdtfl w16du wp14">
+<w:ftr xmlns:wpc="http://schemas.microsoft.com/office/word/2010/wordprocessingCanvas" xmlns:cx="http://schemas.microsoft.com/office/drawing/2014/chartex" xmlns:cx1="http://schemas.microsoft.com/office/drawing/2015/9/8/chartex" xmlns:cx2="http://schemas.microsoft.com/office/drawing/2015/10/21/chartex" xmlns:cx3="http://schemas.microsoft.com/office/drawing/2016/5/9/chartex" xmlns:cx4="http://schemas.microsoft.com/office/drawing/2016/5/10/chartex" xmlns:cx5="http://schemas.microsoft.com/office/drawing/2016/5/11/chartex" xmlns:cx6="http://schemas.microsoft.com/office/drawing/2016/5/12/chartex" xmlns:cx7="http://schemas.microsoft.com/office/drawing/2016/5/13/chartex" xmlns:cx8="http://schemas.microsoft.com/office/drawing/2016/5/14/chartex" xmlns:mc="http://schemas.openxmlformats.org/markup-compatibility/2006" xmlns:aink="http://schemas.microsoft.com/office/drawing/2016/ink" xmlns:am3d="http://schemas.microsoft.com/office/drawing/2017/model3d" xmlns:o="urn:schemas-microsoft-com:office:office" xmlns:oel="http://schemas.microsoft.com/office/2019/extlst" xmlns:r="http://schemas.openxmlformats.org/officeDocument/2006/relationships" xmlns:m="http://schemas.openxmlformats.org/officeDocument/2006/math" xmlns:v="urn:schemas-microsoft-com:vml" xmlns:wp14="http://schemas.microsoft.com/office/word/2010/wordprocessingDrawing" xmlns:wp="http://schemas.openxmlformats.org/drawingml/2006/wordprocessingDrawing" xmlns:w10="urn:schemas-microsoft-com:office:word" xmlns:w="http://schemas.openxmlformats.org/wordprocessingml/2006/main" xmlns:w14="http://schemas.microsoft.com/office/word/2010/wordml" xmlns:w15="http://schemas.microsoft.com/office/word/2012/wordml" xmlns:w16cex="http://schemas.microsoft.com/office/word/2018/wordml/cex" xmlns:w16cid="http://schemas.microsoft.com/office/word/2016/wordml/cid" xmlns:w16="http://schemas.microsoft.com/office/word/2018/wordml" xmlns:w16du="http://schemas.microsoft.com/office/word/2023/wordml/word16du" xmlns:w16sdtdh="http://schemas.microsoft.com/office/word/2020/wordml/sdtdatahash" xmlns:w16sdtfl="http://schemas.microsoft.com/office/word/2024/wordml/sdtformatlock" xmlns:w16se="http://schemas.microsoft.com/office/word/2015/wordml/symex" xmlns:wpg="http://schemas.microsoft.com/office/word/2010/wordprocessingGroup" xmlns:wpi="http://schemas.microsoft.com/office/word/2010/wordprocessingInk" xmlns:wne="http://schemas.microsoft.com/office/word/2006/wordml" xmlns:wps="http://schemas.microsoft.com/office/word/2010/wordprocessingShape" mc:Ignorable="w14 w15 w16se w16cid w16 w16cex w16sdtdh w16sdtfl w16du wp14">
   <w:p>
     <w:pPr>
       <w:pStyle w:val="Footer"/>
@@ -3655,7 +3171,7 @@
 </file>
 
 <file path=word/footnotes.xml><?xml version="1.0" encoding="utf-8"?>
-<w:footnotes xmlns:wpc="http://schemas.microsoft.com/office/word/2010/wordprocessingCanvas" xmlns:cx="http://schemas.microsoft.com/office/drawing/2014/chartex" xmlns:cx1="http://schemas.microsoft.com/office/drawing/2015/9/8/chartex" xmlns:cx2="http://schemas.microsoft.com/office/drawing/2015/10/21/chartex" xmlns:cx3="http://schemas.microsoft.com/office/drawing/2016/5/9/chartex" xmlns:cx4="http://schemas.microsoft.com/office/drawing/2016/5/10/chartex" xmlns:cx5="http://schemas.microsoft.com/office/drawing/2016/5/11/chartex" xmlns:cx6="http://schemas.microsoft.com/office/drawing/2016/5/12/chartex" xmlns:cx7="http://schemas.microsoft.com/office/drawing/2016/5/13/chartex" xmlns:cx8="http://schemas.microsoft.com/office/drawing/2016/5/14/chartex" xmlns:mc="http://schemas.openxmlformats.org/markup-compatibility/2006" xmlns:aink="http://schemas.microsoft.com/office/drawing/2016/ink" xmlns:am3d="http://schemas.microsoft.com/office/drawing/2017/model3d" xmlns:o="urn:schemas-microsoft-com:office:office" xmlns:oel="http://schemas.microsoft.com/office/2019/extlst" xmlns:r="http://schemas.openxmlformats.org/officeDocument/2006/relationships" xmlns:m="http://schemas.openxmlformats.org/officeDocument/2006/math" xmlns:v="urn:schemas-microsoft-com:vml" xmlns:wp14="http://schemas.microsoft.com/office/word/2010/wordprocessingDrawing" xmlns:wp="http://schemas.openxmlformats.org/drawingml/2006/wordprocessingDrawing" xmlns:w10="urn:schemas-microsoft-com:office:word" xmlns:w="http://schemas.openxmlformats.org/wordprocessingml/2006/main" xmlns:w14="http://schemas.microsoft.com/office/word/2010/wordml" xmlns:w15="http://schemas.microsoft.com/office/word/2012/wordml" xmlns:w16cei="http://schemas.microsoft.com/office/word/2026/wordml/cei" xmlns:w16cex="http://schemas.microsoft.com/office/word/2018/wordml/cex" xmlns:w16cid="http://schemas.microsoft.com/office/word/2016/wordml/cid" xmlns:w16="http://schemas.microsoft.com/office/word/2018/wordml" xmlns:w16du="http://schemas.microsoft.com/office/word/2023/wordml/word16du" xmlns:w16sdtdh="http://schemas.microsoft.com/office/word/2020/wordml/sdtdatahash" xmlns:w16sdtfl="http://schemas.microsoft.com/office/word/2024/wordml/sdtformatlock" xmlns:w16se="http://schemas.microsoft.com/office/word/2015/wordml/symex" xmlns:wpg="http://schemas.microsoft.com/office/word/2010/wordprocessingGroup" xmlns:wpi="http://schemas.microsoft.com/office/word/2010/wordprocessingInk" xmlns:wne="http://schemas.microsoft.com/office/word/2006/wordml" xmlns:wps="http://schemas.microsoft.com/office/word/2010/wordprocessingShape" mc:Ignorable="w14 w15 w16se w16cid w16 w16cex w16sdtdh w16sdtfl w16du wp14">
+<w:footnotes xmlns:wpc="http://schemas.microsoft.com/office/word/2010/wordprocessingCanvas" xmlns:cx="http://schemas.microsoft.com/office/drawing/2014/chartex" xmlns:cx1="http://schemas.microsoft.com/office/drawing/2015/9/8/chartex" xmlns:cx2="http://schemas.microsoft.com/office/drawing/2015/10/21/chartex" xmlns:cx3="http://schemas.microsoft.com/office/drawing/2016/5/9/chartex" xmlns:cx4="http://schemas.microsoft.com/office/drawing/2016/5/10/chartex" xmlns:cx5="http://schemas.microsoft.com/office/drawing/2016/5/11/chartex" xmlns:cx6="http://schemas.microsoft.com/office/drawing/2016/5/12/chartex" xmlns:cx7="http://schemas.microsoft.com/office/drawing/2016/5/13/chartex" xmlns:cx8="http://schemas.microsoft.com/office/drawing/2016/5/14/chartex" xmlns:mc="http://schemas.openxmlformats.org/markup-compatibility/2006" xmlns:aink="http://schemas.microsoft.com/office/drawing/2016/ink" xmlns:am3d="http://schemas.microsoft.com/office/drawing/2017/model3d" xmlns:o="urn:schemas-microsoft-com:office:office" xmlns:oel="http://schemas.microsoft.com/office/2019/extlst" xmlns:r="http://schemas.openxmlformats.org/officeDocument/2006/relationships" xmlns:m="http://schemas.openxmlformats.org/officeDocument/2006/math" xmlns:v="urn:schemas-microsoft-com:vml" xmlns:wp14="http://schemas.microsoft.com/office/word/2010/wordprocessingDrawing" xmlns:wp="http://schemas.openxmlformats.org/drawingml/2006/wordprocessingDrawing" xmlns:w10="urn:schemas-microsoft-com:office:word" xmlns:w="http://schemas.openxmlformats.org/wordprocessingml/2006/main" xmlns:w14="http://schemas.microsoft.com/office/word/2010/wordml" xmlns:w15="http://schemas.microsoft.com/office/word/2012/wordml" xmlns:w16cex="http://schemas.microsoft.com/office/word/2018/wordml/cex" xmlns:w16cid="http://schemas.microsoft.com/office/word/2016/wordml/cid" xmlns:w16="http://schemas.microsoft.com/office/word/2018/wordml" xmlns:w16du="http://schemas.microsoft.com/office/word/2023/wordml/word16du" xmlns:w16sdtdh="http://schemas.microsoft.com/office/word/2020/wordml/sdtdatahash" xmlns:w16sdtfl="http://schemas.microsoft.com/office/word/2024/wordml/sdtformatlock" xmlns:w16se="http://schemas.microsoft.com/office/word/2015/wordml/symex" xmlns:wpg="http://schemas.microsoft.com/office/word/2010/wordprocessingGroup" xmlns:wpi="http://schemas.microsoft.com/office/word/2010/wordprocessingInk" xmlns:wne="http://schemas.microsoft.com/office/word/2006/wordml" xmlns:wps="http://schemas.microsoft.com/office/word/2010/wordprocessingShape" mc:Ignorable="w14 w15 w16se w16cid w16 w16cex w16sdtdh w16sdtfl w16du wp14">
   <w:footnote w:type="separator" w:id="-1">
     <w:p>
       <w:pPr>
@@ -3690,7 +3206,7 @@
 </file>
 
 <file path=word/header1.xml><?xml version="1.0" encoding="utf-8"?>
-<w:hdr xmlns:wpc="http://schemas.microsoft.com/office/word/2010/wordprocessingCanvas" xmlns:cx="http://schemas.microsoft.com/office/drawing/2014/chartex" xmlns:cx1="http://schemas.microsoft.com/office/drawing/2015/9/8/chartex" xmlns:cx2="http://schemas.microsoft.com/office/drawing/2015/10/21/chartex" xmlns:cx3="http://schemas.microsoft.com/office/drawing/2016/5/9/chartex" xmlns:cx4="http://schemas.microsoft.com/office/drawing/2016/5/10/chartex" xmlns:cx5="http://schemas.microsoft.com/office/drawing/2016/5/11/chartex" xmlns:cx6="http://schemas.microsoft.com/office/drawing/2016/5/12/chartex" xmlns:cx7="http://schemas.microsoft.com/office/drawing/2016/5/13/chartex" xmlns:cx8="http://schemas.microsoft.com/office/drawing/2016/5/14/chartex" xmlns:mc="http://schemas.openxmlformats.org/markup-compatibility/2006" xmlns:aink="http://schemas.microsoft.com/office/drawing/2016/ink" xmlns:am3d="http://schemas.microsoft.com/office/drawing/2017/model3d" xmlns:o="urn:schemas-microsoft-com:office:office" xmlns:oel="http://schemas.microsoft.com/office/2019/extlst" xmlns:r="http://schemas.openxmlformats.org/officeDocument/2006/relationships" xmlns:m="http://schemas.openxmlformats.org/officeDocument/2006/math" xmlns:v="urn:schemas-microsoft-com:vml" xmlns:wp14="http://schemas.microsoft.com/office/word/2010/wordprocessingDrawing" xmlns:wp="http://schemas.openxmlformats.org/drawingml/2006/wordprocessingDrawing" xmlns:w10="urn:schemas-microsoft-com:office:word" xmlns:w="http://schemas.openxmlformats.org/wordprocessingml/2006/main" xmlns:w14="http://schemas.microsoft.com/office/word/2010/wordml" xmlns:w15="http://schemas.microsoft.com/office/word/2012/wordml" xmlns:w16cei="http://schemas.microsoft.com/office/word/2026/wordml/cei" xmlns:w16cex="http://schemas.microsoft.com/office/word/2018/wordml/cex" xmlns:w16cid="http://schemas.microsoft.com/office/word/2016/wordml/cid" xmlns:w16="http://schemas.microsoft.com/office/word/2018/wordml" xmlns:w16du="http://schemas.microsoft.com/office/word/2023/wordml/word16du" xmlns:w16sdtdh="http://schemas.microsoft.com/office/word/2020/wordml/sdtdatahash" xmlns:w16sdtfl="http://schemas.microsoft.com/office/word/2024/wordml/sdtformatlock" xmlns:w16se="http://schemas.microsoft.com/office/word/2015/wordml/symex" xmlns:wpg="http://schemas.microsoft.com/office/word/2010/wordprocessingGroup" xmlns:wpi="http://schemas.microsoft.com/office/word/2010/wordprocessingInk" xmlns:wne="http://schemas.microsoft.com/office/word/2006/wordml" xmlns:wps="http://schemas.microsoft.com/office/word/2010/wordprocessingShape" mc:Ignorable="w14 w15 w16se w16cid w16 w16cex w16sdtdh w16sdtfl w16du wp14">
+<w:hdr xmlns:wpc="http://schemas.microsoft.com/office/word/2010/wordprocessingCanvas" xmlns:cx="http://schemas.microsoft.com/office/drawing/2014/chartex" xmlns:cx1="http://schemas.microsoft.com/office/drawing/2015/9/8/chartex" xmlns:cx2="http://schemas.microsoft.com/office/drawing/2015/10/21/chartex" xmlns:cx3="http://schemas.microsoft.com/office/drawing/2016/5/9/chartex" xmlns:cx4="http://schemas.microsoft.com/office/drawing/2016/5/10/chartex" xmlns:cx5="http://schemas.microsoft.com/office/drawing/2016/5/11/chartex" xmlns:cx6="http://schemas.microsoft.com/office/drawing/2016/5/12/chartex" xmlns:cx7="http://schemas.microsoft.com/office/drawing/2016/5/13/chartex" xmlns:cx8="http://schemas.microsoft.com/office/drawing/2016/5/14/chartex" xmlns:mc="http://schemas.openxmlformats.org/markup-compatibility/2006" xmlns:aink="http://schemas.microsoft.com/office/drawing/2016/ink" xmlns:am3d="http://schemas.microsoft.com/office/drawing/2017/model3d" xmlns:o="urn:schemas-microsoft-com:office:office" xmlns:oel="http://schemas.microsoft.com/office/2019/extlst" xmlns:r="http://schemas.openxmlformats.org/officeDocument/2006/relationships" xmlns:m="http://schemas.openxmlformats.org/officeDocument/2006/math" xmlns:v="urn:schemas-microsoft-com:vml" xmlns:wp14="http://schemas.microsoft.com/office/word/2010/wordprocessingDrawing" xmlns:wp="http://schemas.openxmlformats.org/drawingml/2006/wordprocessingDrawing" xmlns:w10="urn:schemas-microsoft-com:office:word" xmlns:w="http://schemas.openxmlformats.org/wordprocessingml/2006/main" xmlns:w14="http://schemas.microsoft.com/office/word/2010/wordml" xmlns:w15="http://schemas.microsoft.com/office/word/2012/wordml" xmlns:w16cex="http://schemas.microsoft.com/office/word/2018/wordml/cex" xmlns:w16cid="http://schemas.microsoft.com/office/word/2016/wordml/cid" xmlns:w16="http://schemas.microsoft.com/office/word/2018/wordml" xmlns:w16du="http://schemas.microsoft.com/office/word/2023/wordml/word16du" xmlns:w16sdtdh="http://schemas.microsoft.com/office/word/2020/wordml/sdtdatahash" xmlns:w16sdtfl="http://schemas.microsoft.com/office/word/2024/wordml/sdtformatlock" xmlns:w16se="http://schemas.microsoft.com/office/word/2015/wordml/symex" xmlns:wpg="http://schemas.microsoft.com/office/word/2010/wordprocessingGroup" xmlns:wpi="http://schemas.microsoft.com/office/word/2010/wordprocessingInk" xmlns:wne="http://schemas.microsoft.com/office/word/2006/wordml" xmlns:wps="http://schemas.microsoft.com/office/word/2010/wordprocessingShape" mc:Ignorable="w14 w15 w16se w16cid w16 w16cex w16sdtdh w16sdtfl w16du wp14">
   <w:p>
     <w:pPr>
       <w:pStyle w:val="Header"/>
@@ -3755,7 +3271,7 @@
 </file>
 
 <file path=word/numbering.xml><?xml version="1.0" encoding="utf-8"?>
-<w:numbering xmlns:wpc="http://schemas.microsoft.com/office/word/2010/wordprocessingCanvas" xmlns:cx="http://schemas.microsoft.com/office/drawing/2014/chartex" xmlns:cx1="http://schemas.microsoft.com/office/drawing/2015/9/8/chartex" xmlns:cx2="http://schemas.microsoft.com/office/drawing/2015/10/21/chartex" xmlns:cx3="http://schemas.microsoft.com/office/drawing/2016/5/9/chartex" xmlns:cx4="http://schemas.microsoft.com/office/drawing/2016/5/10/chartex" xmlns:cx5="http://schemas.microsoft.com/office/drawing/2016/5/11/chartex" xmlns:cx6="http://schemas.microsoft.com/office/drawing/2016/5/12/chartex" xmlns:cx7="http://schemas.microsoft.com/office/drawing/2016/5/13/chartex" xmlns:cx8="http://schemas.microsoft.com/office/drawing/2016/5/14/chartex" xmlns:mc="http://schemas.openxmlformats.org/markup-compatibility/2006" xmlns:aink="http://schemas.microsoft.com/office/drawing/2016/ink" xmlns:am3d="http://schemas.microsoft.com/office/drawing/2017/model3d" xmlns:o="urn:schemas-microsoft-com:office:office" xmlns:oel="http://schemas.microsoft.com/office/2019/extlst" xmlns:r="http://schemas.openxmlformats.org/officeDocument/2006/relationships" xmlns:m="http://schemas.openxmlformats.org/officeDocument/2006/math" xmlns:v="urn:schemas-microsoft-com:vml" xmlns:wp14="http://schemas.microsoft.com/office/word/2010/wordprocessingDrawing" xmlns:wp="http://schemas.openxmlformats.org/drawingml/2006/wordprocessingDrawing" xmlns:w10="urn:schemas-microsoft-com:office:word" xmlns:w="http://schemas.openxmlformats.org/wordprocessingml/2006/main" xmlns:w14="http://schemas.microsoft.com/office/word/2010/wordml" xmlns:w15="http://schemas.microsoft.com/office/word/2012/wordml" xmlns:w16cei="http://schemas.microsoft.com/office/word/2026/wordml/cei" xmlns:w16cex="http://schemas.microsoft.com/office/word/2018/wordml/cex" xmlns:w16cid="http://schemas.microsoft.com/office/word/2016/wordml/cid" xmlns:w16="http://schemas.microsoft.com/office/word/2018/wordml" xmlns:w16du="http://schemas.microsoft.com/office/word/2023/wordml/word16du" xmlns:w16sdtdh="http://schemas.microsoft.com/office/word/2020/wordml/sdtdatahash" xmlns:w16sdtfl="http://schemas.microsoft.com/office/word/2024/wordml/sdtformatlock" xmlns:w16se="http://schemas.microsoft.com/office/word/2015/wordml/symex" xmlns:wpg="http://schemas.microsoft.com/office/word/2010/wordprocessingGroup" xmlns:wpi="http://schemas.microsoft.com/office/word/2010/wordprocessingInk" xmlns:wne="http://schemas.microsoft.com/office/word/2006/wordml" xmlns:wps="http://schemas.microsoft.com/office/word/2010/wordprocessingShape" mc:Ignorable="w14 w15 w16se w16cid w16 w16cex w16sdtdh w16sdtfl w16du wp14">
+<w:numbering xmlns:wpc="http://schemas.microsoft.com/office/word/2010/wordprocessingCanvas" xmlns:cx="http://schemas.microsoft.com/office/drawing/2014/chartex" xmlns:cx1="http://schemas.microsoft.com/office/drawing/2015/9/8/chartex" xmlns:cx2="http://schemas.microsoft.com/office/drawing/2015/10/21/chartex" xmlns:cx3="http://schemas.microsoft.com/office/drawing/2016/5/9/chartex" xmlns:cx4="http://schemas.microsoft.com/office/drawing/2016/5/10/chartex" xmlns:cx5="http://schemas.microsoft.com/office/drawing/2016/5/11/chartex" xmlns:cx6="http://schemas.microsoft.com/office/drawing/2016/5/12/chartex" xmlns:cx7="http://schemas.microsoft.com/office/drawing/2016/5/13/chartex" xmlns:cx8="http://schemas.microsoft.com/office/drawing/2016/5/14/chartex" xmlns:mc="http://schemas.openxmlformats.org/markup-compatibility/2006" xmlns:aink="http://schemas.microsoft.com/office/drawing/2016/ink" xmlns:am3d="http://schemas.microsoft.com/office/drawing/2017/model3d" xmlns:o="urn:schemas-microsoft-com:office:office" xmlns:oel="http://schemas.microsoft.com/office/2019/extlst" xmlns:r="http://schemas.openxmlformats.org/officeDocument/2006/relationships" xmlns:m="http://schemas.openxmlformats.org/officeDocument/2006/math" xmlns:v="urn:schemas-microsoft-com:vml" xmlns:wp14="http://schemas.microsoft.com/office/word/2010/wordprocessingDrawing" xmlns:wp="http://schemas.openxmlformats.org/drawingml/2006/wordprocessingDrawing" xmlns:w10="urn:schemas-microsoft-com:office:word" xmlns:w="http://schemas.openxmlformats.org/wordprocessingml/2006/main" xmlns:w14="http://schemas.microsoft.com/office/word/2010/wordml" xmlns:w15="http://schemas.microsoft.com/office/word/2012/wordml" xmlns:w16cex="http://schemas.microsoft.com/office/word/2018/wordml/cex" xmlns:w16cid="http://schemas.microsoft.com/office/word/2016/wordml/cid" xmlns:w16="http://schemas.microsoft.com/office/word/2018/wordml" xmlns:w16du="http://schemas.microsoft.com/office/word/2023/wordml/word16du" xmlns:w16sdtdh="http://schemas.microsoft.com/office/word/2020/wordml/sdtdatahash" xmlns:w16sdtfl="http://schemas.microsoft.com/office/word/2024/wordml/sdtformatlock" xmlns:w16se="http://schemas.microsoft.com/office/word/2015/wordml/symex" xmlns:wpg="http://schemas.microsoft.com/office/word/2010/wordprocessingGroup" xmlns:wpi="http://schemas.microsoft.com/office/word/2010/wordprocessingInk" xmlns:wne="http://schemas.microsoft.com/office/word/2006/wordml" xmlns:wps="http://schemas.microsoft.com/office/word/2010/wordprocessingShape" mc:Ignorable="w14 w15 w16se w16cid w16 w16cex w16sdtdh w16sdtfl w16du wp14">
   <w:abstractNum w:abstractNumId="0" w15:restartNumberingAfterBreak="0">
     <w:nsid w:val="021216EB"/>
     <w:multiLevelType w:val="hybridMultilevel"/>
@@ -10207,7 +9723,6 @@
   <w:style w:type="character" w:default="1" w:styleId="DefaultParagraphFont">
     <w:name w:val="Default Paragraph Font"/>
     <w:uiPriority w:val="1"/>
-    <w:semiHidden/>
     <w:unhideWhenUsed/>
   </w:style>
   <w:style w:type="table" w:default="1" w:styleId="TableNormal">
@@ -10568,6 +10083,22 @@
       <w:color w:val="808080"/>
     </w:rPr>
   </w:style>
+  <w:style w:type="paragraph" w:styleId="NoSpacing">
+    <w:name w:val="No Spacing"/>
+    <w:uiPriority w:val="1"/>
+    <w:qFormat/>
+    <w:rsid w:val="006646CF"/>
+    <w:pPr>
+      <w:suppressAutoHyphens/>
+      <w:autoSpaceDN w:val="0"/>
+      <w:textAlignment w:val="baseline"/>
+    </w:pPr>
+    <w:rPr>
+      <w:sz w:val="22"/>
+      <w:szCs w:val="22"/>
+      <w:lang w:val="pt-PT"/>
+    </w:rPr>
+  </w:style>
 </w:styles>
 </file>
 
@@ -10833,17 +10364,6 @@
 </file>
 
 <file path=customXml/item1.xml><?xml version="1.0" encoding="utf-8"?>
-<p:properties xmlns:p="http://schemas.microsoft.com/office/2006/metadata/properties" xmlns:xsi="http://www.w3.org/2001/XMLSchema-instance" xmlns:pc="http://schemas.microsoft.com/office/infopath/2007/PartnerControls">
-  <documentManagement>
-    <lcf76f155ced4ddcb4097134ff3c332f xmlns="02ba216b-89f7-42f9-9c9a-5a7303bb8c17">
-      <Terms xmlns="http://schemas.microsoft.com/office/infopath/2007/PartnerControls"/>
-    </lcf76f155ced4ddcb4097134ff3c332f>
-    <TaxCatchAll xmlns="9eeac3a0-a2fe-44f5-ab03-0910ba0ce041" xsi:nil="true"/>
-  </documentManagement>
-</p:properties>
-</file>
-
-<file path=customXml/item2.xml><?xml version="1.0" encoding="utf-8"?>
 <ct:contentTypeSchema xmlns:ct="http://schemas.microsoft.com/office/2006/metadata/contentType" xmlns:ma="http://schemas.microsoft.com/office/2006/metadata/properties/metaAttributes" ct:_="" ma:_="" ma:contentTypeName="Documento" ma:contentTypeID="0x01010098B5E2B69643764AACEDBF1C89D5C809" ma:contentTypeVersion="18" ma:contentTypeDescription="Criar um novo documento." ma:contentTypeScope="" ma:versionID="8688a9b526eed4c06eb4e3f1213fa09e">
   <xsd:schema xmlns:xsd="http://www.w3.org/2001/XMLSchema" xmlns:xs="http://www.w3.org/2001/XMLSchema" xmlns:p="http://schemas.microsoft.com/office/2006/metadata/properties" xmlns:ns2="02ba216b-89f7-42f9-9c9a-5a7303bb8c17" xmlns:ns3="9eeac3a0-a2fe-44f5-ab03-0910ba0ce041" targetNamespace="http://schemas.microsoft.com/office/2006/metadata/properties" ma:root="true" ma:fieldsID="37e45ec92a73c89dda295af488f45c43" ns2:_="" ns3:_="">
     <xsd:import namespace="02ba216b-89f7-42f9-9c9a-5a7303bb8c17"/>
@@ -11098,11 +10618,18 @@
 </ct:contentTypeSchema>
 </file>
 
-<file path=customXml/item3.xml><?xml version="1.0" encoding="utf-8"?>
-<b:Sources xmlns:b="http://schemas.openxmlformats.org/officeDocument/2006/bibliography" xmlns="http://schemas.openxmlformats.org/officeDocument/2006/bibliography" SelectedStyle="\APASixthEditionOfficeOnline.xsl" StyleName="APA" Version="6"/>
+<file path=customXml/item2.xml><?xml version="1.0" encoding="utf-8"?>
+<p:properties xmlns:p="http://schemas.microsoft.com/office/2006/metadata/properties" xmlns:xsi="http://www.w3.org/2001/XMLSchema-instance" xmlns:pc="http://schemas.microsoft.com/office/infopath/2007/PartnerControls">
+  <documentManagement>
+    <lcf76f155ced4ddcb4097134ff3c332f xmlns="02ba216b-89f7-42f9-9c9a-5a7303bb8c17">
+      <Terms xmlns="http://schemas.microsoft.com/office/infopath/2007/PartnerControls"/>
+    </lcf76f155ced4ddcb4097134ff3c332f>
+    <TaxCatchAll xmlns="9eeac3a0-a2fe-44f5-ab03-0910ba0ce041" xsi:nil="true"/>
+  </documentManagement>
+</p:properties>
 </file>
 
-<file path=customXml/item4.xml><?xml version="1.0" encoding="utf-8"?>
+<file path=customXml/item3.xml><?xml version="1.0" encoding="utf-8"?>
 <?mso-contentType ?>
 <FormTemplates xmlns="http://schemas.microsoft.com/sharepoint/v3/contenttype/forms">
   <Display>DocumentLibraryForm</Display>
@@ -11111,18 +10638,11 @@
 </FormTemplates>
 </file>
 
-<file path=customXml/itemProps1.xml><?xml version="1.0" encoding="utf-8"?>
-<ds:datastoreItem xmlns:ds="http://schemas.openxmlformats.org/officeDocument/2006/customXml" ds:itemID="{D80EB5E1-B87D-48EC-BA24-FB4A0504BAE0}">
-  <ds:schemaRefs>
-    <ds:schemaRef ds:uri="http://schemas.microsoft.com/office/2006/metadata/properties"/>
-    <ds:schemaRef ds:uri="http://schemas.microsoft.com/office/infopath/2007/PartnerControls"/>
-    <ds:schemaRef ds:uri="02ba216b-89f7-42f9-9c9a-5a7303bb8c17"/>
-    <ds:schemaRef ds:uri="9eeac3a0-a2fe-44f5-ab03-0910ba0ce041"/>
-  </ds:schemaRefs>
-</ds:datastoreItem>
+<file path=customXml/item4.xml><?xml version="1.0" encoding="utf-8"?>
+<b:Sources xmlns:b="http://schemas.openxmlformats.org/officeDocument/2006/bibliography" xmlns="http://schemas.openxmlformats.org/officeDocument/2006/bibliography" SelectedStyle="\APASixthEditionOfficeOnline.xsl" StyleName="APA" Version="6"/>
 </file>
 
-<file path=customXml/itemProps2.xml><?xml version="1.0" encoding="utf-8"?>
+<file path=customXml/itemProps1.xml><?xml version="1.0" encoding="utf-8"?>
 <ds:datastoreItem xmlns:ds="http://schemas.openxmlformats.org/officeDocument/2006/customXml" ds:itemID="{59D37012-FB8C-4336-841A-A2C9B84134A9}">
   <ds:schemaRefs>
     <ds:schemaRef ds:uri="http://schemas.microsoft.com/office/2006/metadata/contentType"/>
@@ -11141,18 +10661,29 @@
 </ds:datastoreItem>
 </file>
 
+<file path=customXml/itemProps2.xml><?xml version="1.0" encoding="utf-8"?>
+<ds:datastoreItem xmlns:ds="http://schemas.openxmlformats.org/officeDocument/2006/customXml" ds:itemID="{D80EB5E1-B87D-48EC-BA24-FB4A0504BAE0}">
+  <ds:schemaRefs>
+    <ds:schemaRef ds:uri="http://schemas.microsoft.com/office/2006/metadata/properties"/>
+    <ds:schemaRef ds:uri="http://schemas.microsoft.com/office/infopath/2007/PartnerControls"/>
+    <ds:schemaRef ds:uri="02ba216b-89f7-42f9-9c9a-5a7303bb8c17"/>
+    <ds:schemaRef ds:uri="9eeac3a0-a2fe-44f5-ab03-0910ba0ce041"/>
+  </ds:schemaRefs>
+</ds:datastoreItem>
+</file>
+
 <file path=customXml/itemProps3.xml><?xml version="1.0" encoding="utf-8"?>
+<ds:datastoreItem xmlns:ds="http://schemas.openxmlformats.org/officeDocument/2006/customXml" ds:itemID="{91FBD0E4-FF6D-4ED3-83F5-E908BDBA29E6}">
+  <ds:schemaRefs>
+    <ds:schemaRef ds:uri="http://schemas.microsoft.com/sharepoint/v3/contenttype/forms"/>
+  </ds:schemaRefs>
+</ds:datastoreItem>
+</file>
+
+<file path=customXml/itemProps4.xml><?xml version="1.0" encoding="utf-8"?>
 <ds:datastoreItem xmlns:ds="http://schemas.openxmlformats.org/officeDocument/2006/customXml" ds:itemID="{A30C39F3-0BC6-4EAD-993D-EE7DEC7944C7}">
   <ds:schemaRefs>
     <ds:schemaRef ds:uri="http://schemas.openxmlformats.org/officeDocument/2006/bibliography"/>
   </ds:schemaRefs>
 </ds:datastoreItem>
-</file>
-
-<file path=customXml/itemProps4.xml><?xml version="1.0" encoding="utf-8"?>
-<ds:datastoreItem xmlns:ds="http://schemas.openxmlformats.org/officeDocument/2006/customXml" ds:itemID="{91FBD0E4-FF6D-4ED3-83F5-E908BDBA29E6}">
-  <ds:schemaRefs>
-    <ds:schemaRef ds:uri="http://schemas.microsoft.com/sharepoint/v3/contenttype/forms"/>
-  </ds:schemaRefs>
-</ds:datastoreItem>
 </file>
</xml_diff>